<commit_message>
fix: place timeline and location tokens, stop naked year replacement clobbering sentence literals
</commit_message>
<xml_diff>
--- a/01. Hồ sơ đạo đức đề cương - MẪU/04. QĐ chấp nhận đạo đức.docx
+++ b/01. Hồ sơ đạo đức đề cương - MẪU/04. QĐ chấp nhận đạo đức.docx
@@ -1079,14 +1079,13 @@
           <w:sz w:val="28"/>
           <w:szCs w:val="28"/>
         </w:rPr>
-        <w:t xml:space="preserve">Địa điểm triển khai nghiên cứu: </w:t>
-      </w:r>
-      <w:r>
-        <w:rPr>
-          <w:sz w:val="28"/>
-          <w:szCs w:val="28"/>
-        </w:rPr>
-        <w:t>tỉnh</w:t>
+        <w:t xml:space="preserve">Địa điểm triển khai nghiên cứu: {{DIA_DIEM_TRIEN_KHAI}} </w:t>
+      </w:r>
+      <w:r>
+        <w:rPr>
+          <w:sz w:val="28"/>
+          <w:szCs w:val="28"/>
+        </w:rPr>
       </w:r>
       <w:r>
         <w:rPr>
@@ -1094,7 +1093,6 @@
           <w:szCs w:val="28"/>
           <w:lang w:val="vi-VN"/>
         </w:rPr>
-        <w:t xml:space="preserve"> </w:t>
       </w:r>
       <w:r>
         <w:rPr>
@@ -1102,21 +1100,18 @@
           <w:szCs w:val="28"/>
           <w:lang w:val="vi-VN"/>
         </w:rPr>
-        <w:t>Thái Nguyên</w:t>
-      </w:r>
-      <w:r>
-        <w:rPr>
-          <w:sz w:val="28"/>
-          <w:szCs w:val="28"/>
-        </w:rPr>
-        <w:t>.</w:t>
-      </w:r>
-      <w:r>
-        <w:rPr>
-          <w:sz w:val="28"/>
-          <w:szCs w:val="28"/>
-        </w:rPr>
-        <w:t xml:space="preserve"> </w:t>
+      </w:r>
+      <w:r>
+        <w:rPr>
+          <w:sz w:val="28"/>
+          <w:szCs w:val="28"/>
+        </w:rPr>
+      </w:r>
+      <w:r>
+        <w:rPr>
+          <w:sz w:val="28"/>
+          <w:szCs w:val="28"/>
+        </w:rPr>
       </w:r>
     </w:p>
     <w:p>
@@ -1138,7 +1133,7 @@
           <w:sz w:val="28"/>
           <w:szCs w:val="28"/>
         </w:rPr>
-        <w:t>Thời gian nghiên cứu: Từ 12/{{NAM}} đến 05/{{NAM}}</w:t>
+        <w:t>Thời gian nghiên cứu: Từ {{THOI_GIAN_BAT_DAU}} đến {{THOI_GIAN_KET_THUC}}</w:t>
       </w:r>
       <w:r>
         <w:rPr>

</xml_diff>